<commit_message>
Handover docs: page break per section (less cramped), clickable live+repo links; add repeatable build-handover-docs.ps1
</commit_message>
<xml_diff>
--- a/BookLab-Task1-Handover.docx
+++ b/BookLab-Task1-Handover.docx
@@ -28,7 +28,7 @@
         </w:p>
       </w:sdtContent>
     </w:sdt>
-    <w:bookmarkStart w:id="26" w:name="booklab-handover-document"/>
+    <w:bookmarkStart w:id="28" w:name="booklab-handover-document"/>
     <w:p>
       <w:pPr>
         <w:pStyle w:val="Heading1"/>
@@ -138,9 +138,14 @@
             <w:pPr>
               <w:pStyle w:val="Compact"/>
             </w:pPr>
-            <w:r>
-              <w:t xml:space="preserve">https://adeeb-booklab-07111926.web.app</w:t>
-            </w:r>
+            <w:hyperlink r:id="rId9">
+              <w:r>
+                <w:rPr>
+                  <w:rStyle w:val="Hyperlink"/>
+                </w:rPr>
+                <w:t xml:space="preserve">https://adeeb-booklab-07111926.web.app</w:t>
+              </w:r>
+            </w:hyperlink>
           </w:p>
         </w:tc>
       </w:tr>
@@ -166,9 +171,14 @@
             <w:pPr>
               <w:pStyle w:val="Compact"/>
             </w:pPr>
-            <w:r>
-              <w:t xml:space="preserve">https://github.com/alishehroz-ideo/webgl-and-firebase-learning</w:t>
-            </w:r>
+            <w:hyperlink r:id="rId10">
+              <w:r>
+                <w:rPr>
+                  <w:rStyle w:val="Hyperlink"/>
+                </w:rPr>
+                <w:t xml:space="preserve">https://github.com/alishehroz-ideo/webgl-and-firebase-learning</w:t>
+              </w:r>
+            </w:hyperlink>
           </w:p>
         </w:tc>
       </w:tr>
@@ -208,7 +218,12 @@
         </w:pict>
       </w:r>
     </w:p>
-    <w:bookmarkStart w:id="12" w:name="overview-of-the-implementation"/>
+    <w:p>
+      <w:r>
+        <w:br w:type="page"/>
+      </w:r>
+    </w:p>
+    <w:bookmarkStart w:id="14" w:name="overview-of-the-implementation"/>
     <w:p>
       <w:pPr>
         <w:pStyle w:val="Heading2"/>
@@ -396,18 +411,18 @@
           <wp:inline>
             <wp:extent cx="5334000" cy="3580836"/>
             <wp:effectExtent b="0" l="0" r="0" t="0"/>
-            <wp:docPr descr="The Editor — a page being made (the real screen)." title="" id="10" name="Picture"/>
+            <wp:docPr descr="The Editor — a page being made (the real screen)." title="" id="12" name="Picture"/>
             <a:graphic>
               <a:graphicData uri="http://schemas.openxmlformats.org/drawingml/2006/picture">
                 <pic:pic>
                   <pic:nvPicPr>
-                    <pic:cNvPr descr="../video/shots/editor-screen.png" id="11" name="Picture"/>
+                    <pic:cNvPr descr="../video/shots/editor-screen.png" id="13" name="Picture"/>
                     <pic:cNvPicPr>
                       <a:picLocks noChangeArrowheads="1" noChangeAspect="1"/>
                     </pic:cNvPicPr>
                   </pic:nvPicPr>
                   <pic:blipFill>
-                    <a:blip r:embed="rId9"/>
+                    <a:blip r:embed="rId11"/>
                     <a:stretch>
                       <a:fillRect/>
                     </a:stretch>
@@ -442,8 +457,13 @@
         <w:t xml:space="preserve">The Editor — a page being made (the real screen).</w:t>
       </w:r>
     </w:p>
-    <w:bookmarkEnd w:id="12"/>
-    <w:bookmarkStart w:id="16" w:name="explanation-of-the-architecture"/>
+    <w:p>
+      <w:r>
+        <w:br w:type="page"/>
+      </w:r>
+    </w:p>
+    <w:bookmarkEnd w:id="14"/>
+    <w:bookmarkStart w:id="18" w:name="explanation-of-the-architecture"/>
     <w:p>
       <w:pPr>
         <w:pStyle w:val="Heading2"/>
@@ -485,18 +505,18 @@
           <wp:inline>
             <wp:extent cx="2397418" cy="4280006"/>
             <wp:effectExtent b="0" l="0" r="0" t="0"/>
-            <wp:docPr descr="The Unity project — App / Features / Services / Core / Models." title="" id="14" name="Picture"/>
+            <wp:docPr descr="The Unity project — App / Features / Services / Core / Models." title="" id="16" name="Picture"/>
             <a:graphic>
               <a:graphicData uri="http://schemas.openxmlformats.org/drawingml/2006/picture">
                 <pic:pic>
                   <pic:nvPicPr>
-                    <pic:cNvPr descr="../video/shots/project-folder.png" id="15" name="Picture"/>
+                    <pic:cNvPr descr="../video/shots/project-folder.png" id="17" name="Picture"/>
                     <pic:cNvPicPr>
                       <a:picLocks noChangeArrowheads="1" noChangeAspect="1"/>
                     </pic:cNvPicPr>
                   </pic:nvPicPr>
                   <pic:blipFill>
-                    <a:blip r:embed="rId13"/>
+                    <a:blip r:embed="rId15"/>
                     <a:stretch>
                       <a:fillRect/>
                     </a:stretch>
@@ -1082,8 +1102,13 @@
         <w:t xml:space="preserve">means here.</w:t>
       </w:r>
     </w:p>
-    <w:bookmarkEnd w:id="16"/>
-    <w:bookmarkStart w:id="17" w:name="how-asset-loading-caching-work"/>
+    <w:p>
+      <w:r>
+        <w:br w:type="page"/>
+      </w:r>
+    </w:p>
+    <w:bookmarkEnd w:id="18"/>
+    <w:bookmarkStart w:id="19" w:name="how-asset-loading-caching-work"/>
     <w:p>
       <w:pPr>
         <w:pStyle w:val="Heading2"/>
@@ -1529,8 +1554,13 @@
         <w:t xml:space="preserve">(has everything, always restockable). A cache miss simply re-downloads — no data is lost.</w:t>
       </w:r>
     </w:p>
-    <w:bookmarkEnd w:id="17"/>
-    <w:bookmarkStart w:id="21" w:name="how-data-is-saved-loaded"/>
+    <w:p>
+      <w:r>
+        <w:br w:type="page"/>
+      </w:r>
+    </w:p>
+    <w:bookmarkEnd w:id="19"/>
+    <w:bookmarkStart w:id="23" w:name="how-data-is-saved-loaded"/>
     <w:p>
       <w:pPr>
         <w:pStyle w:val="Heading2"/>
@@ -2162,18 +2192,18 @@
           <wp:inline>
             <wp:extent cx="3626863" cy="4011065"/>
             <wp:effectExtent b="0" l="0" r="0" t="0"/>
-            <wp:docPr descr="A saved book in the Realtime Database — references and numbers, never image bytes." title="" id="19" name="Picture"/>
+            <wp:docPr descr="A saved book in the Realtime Database — references and numbers, never image bytes." title="" id="21" name="Picture"/>
             <a:graphic>
               <a:graphicData uri="http://schemas.openxmlformats.org/drawingml/2006/picture">
                 <pic:pic>
                   <pic:nvPicPr>
-                    <pic:cNvPr descr="../video/shots/firebase-data.png" id="20" name="Picture"/>
+                    <pic:cNvPr descr="../video/shots/firebase-data.png" id="22" name="Picture"/>
                     <pic:cNvPicPr>
                       <a:picLocks noChangeArrowheads="1" noChangeAspect="1"/>
                     </pic:cNvPicPr>
                   </pic:nvPicPr>
                   <pic:blipFill>
-                    <a:blip r:embed="rId18"/>
+                    <a:blip r:embed="rId20"/>
                     <a:stretch>
                       <a:fillRect/>
                     </a:stretch>
@@ -2555,8 +2585,13 @@
         <w:t xml:space="preserve">cannot handle. On save, the shelf card uses the first page’s background as its cover (a true page snapshot is reserved; keeping the cover inline avoids paid Firebase Storage).</w:t>
       </w:r>
     </w:p>
-    <w:bookmarkEnd w:id="21"/>
-    <w:bookmarkStart w:id="22" w:name="key-decisions-challenges"/>
+    <w:p>
+      <w:r>
+        <w:br w:type="page"/>
+      </w:r>
+    </w:p>
+    <w:bookmarkEnd w:id="23"/>
+    <w:bookmarkStart w:id="24" w:name="key-decisions-challenges"/>
     <w:p>
       <w:pPr>
         <w:pStyle w:val="Heading2"/>
@@ -2910,8 +2945,13 @@
         <w:t xml:space="preserve">Realtime Database + Hosting on the free Spark plan; covers stored inline (no Storage), no Cloud Functions, no credit card.</w:t>
       </w:r>
     </w:p>
-    <w:bookmarkEnd w:id="22"/>
-    <w:bookmarkStart w:id="23" w:name="performance-scalability"/>
+    <w:p>
+      <w:r>
+        <w:br w:type="page"/>
+      </w:r>
+    </w:p>
+    <w:bookmarkEnd w:id="24"/>
+    <w:bookmarkStart w:id="25" w:name="performance-scalability"/>
     <w:p>
       <w:pPr>
         <w:pStyle w:val="Heading2"/>
@@ -3182,8 +3222,13 @@
         <w:t xml:space="preserve">for discovery; rely on CDN + browser cache for images.</w:t>
       </w:r>
     </w:p>
-    <w:bookmarkEnd w:id="23"/>
-    <w:bookmarkStart w:id="24" w:name="any-use-of-ai-tools"/>
+    <w:p>
+      <w:r>
+        <w:br w:type="page"/>
+      </w:r>
+    </w:p>
+    <w:bookmarkEnd w:id="25"/>
+    <w:bookmarkStart w:id="26" w:name="any-use-of-ai-tools"/>
     <w:p>
       <w:pPr>
         <w:pStyle w:val="Heading2"/>
@@ -3312,8 +3357,13 @@
         <w:t xml:space="preserve">The build was quicker for it — and the direction, the decisions, and the understanding are mine.</w:t>
       </w:r>
     </w:p>
-    <w:bookmarkEnd w:id="24"/>
-    <w:bookmarkStart w:id="25" w:name="tech-stack-running-deploying"/>
+    <w:p>
+      <w:r>
+        <w:br w:type="page"/>
+      </w:r>
+    </w:p>
+    <w:bookmarkEnd w:id="26"/>
+    <w:bookmarkStart w:id="27" w:name="tech-stack-running-deploying"/>
     <w:p>
       <w:pPr>
         <w:pStyle w:val="Heading2"/>
@@ -3638,9 +3688,14 @@
             <w:pPr>
               <w:pStyle w:val="Compact"/>
             </w:pPr>
-            <w:r>
-              <w:t xml:space="preserve">https://adeeb-booklab-07111926.web.app</w:t>
-            </w:r>
+            <w:hyperlink r:id="rId9">
+              <w:r>
+                <w:rPr>
+                  <w:rStyle w:val="Hyperlink"/>
+                </w:rPr>
+                <w:t xml:space="preserve">https://adeeb-booklab-07111926.web.app</w:t>
+              </w:r>
+            </w:hyperlink>
           </w:p>
         </w:tc>
       </w:tr>
@@ -3662,9 +3717,14 @@
             <w:pPr>
               <w:pStyle w:val="Compact"/>
             </w:pPr>
-            <w:r>
-              <w:t xml:space="preserve">https://github.com/alishehroz-ideo/webgl-and-firebase-learning</w:t>
-            </w:r>
+            <w:hyperlink r:id="rId10">
+              <w:r>
+                <w:rPr>
+                  <w:rStyle w:val="Hyperlink"/>
+                </w:rPr>
+                <w:t xml:space="preserve">https://github.com/alishehroz-ideo/webgl-and-firebase-learning</w:t>
+              </w:r>
+            </w:hyperlink>
           </w:p>
         </w:tc>
       </w:tr>
@@ -3699,8 +3759,8 @@
         <w:t xml:space="preserve">Art credit: sticker items are OpenMoji (CC BY-SA 4.0); backgrounds are generated flat illustrations.</w:t>
       </w:r>
     </w:p>
-    <w:bookmarkEnd w:id="25"/>
-    <w:bookmarkEnd w:id="26"/>
+    <w:bookmarkEnd w:id="27"/>
+    <w:bookmarkEnd w:id="28"/>
     <w:sectPr>
       <w:footnotePr>
         <w:numRestart w:val="eachSect"/>

</xml_diff>